<commit_message>
update the vm documentation
</commit_message>
<xml_diff>
--- a/vm_note.docx
+++ b/vm_note.docx
@@ -727,13 +727,7 @@
       <w:proofErr w:type="spellEnd"/>
       <w:proofErr w:type="gramEnd"/>
       <w:r>
-        <w:t xml:space="preserve"> </w:t>
-      </w:r>
-      <w:r>
-        <w:t>8080</w:t>
-      </w:r>
-      <w:r>
-        <w:t xml:space="preserve"> &amp;</w:t>
+        <w:t xml:space="preserve"> 8080 &amp;</w:t>
       </w:r>
     </w:p>
     <w:p>
@@ -1210,11 +1204,163 @@
       </w:r>
       <w:proofErr w:type="spellEnd"/>
       <w:r>
-        <w:t xml:space="preserve"> localadmin@192.168.85.1</w:t>
-      </w:r>
-      <w:r>
-        <w:t>30</w:t>
-      </w:r>
+        <w:t xml:space="preserve"> localadmin@192.168.85.130:/home/</w:t>
+      </w:r>
+      <w:proofErr w:type="spellStart"/>
+      <w:r>
+        <w:t>localadmin</w:t>
+      </w:r>
+      <w:proofErr w:type="spellEnd"/>
+      <w:r>
+        <w:t>/</w:t>
+      </w:r>
+      <w:proofErr w:type="spellStart"/>
+      <w:r>
+        <w:t>fyp</w:t>
+      </w:r>
+      <w:proofErr w:type="spellEnd"/>
+      <w:r>
+        <w:t>/*.csv localadmin@192.168.85.130:/home/</w:t>
+      </w:r>
+      <w:proofErr w:type="spellStart"/>
+      <w:r>
+        <w:t>localadmin</w:t>
+      </w:r>
+      <w:proofErr w:type="spellEnd"/>
+      <w:r>
+        <w:t>/</w:t>
+      </w:r>
+      <w:proofErr w:type="spellStart"/>
+      <w:r>
+        <w:t>fyp</w:t>
+      </w:r>
+      <w:proofErr w:type="spellEnd"/>
+      <w:r>
+        <w:t>/*.txt localadmin@192.168.85.130:/home/</w:t>
+      </w:r>
+      <w:proofErr w:type="spellStart"/>
+      <w:r>
+        <w:t>localadmin</w:t>
+      </w:r>
+      <w:proofErr w:type="spellEnd"/>
+      <w:r>
+        <w:t>/</w:t>
+      </w:r>
+      <w:proofErr w:type="spellStart"/>
+      <w:r>
+        <w:t>fyp</w:t>
+      </w:r>
+      <w:proofErr w:type="spellEnd"/>
+      <w:r>
+        <w:t>/*.</w:t>
+      </w:r>
+      <w:proofErr w:type="spellStart"/>
+      <w:r>
+        <w:t>pcap</w:t>
+      </w:r>
+      <w:proofErr w:type="spellEnd"/>
+      <w:r>
+        <w:t xml:space="preserve"> "D:/"</w:t>
+      </w:r>
+    </w:p>
+    <w:p/>
+    <w:p>
+      <w:pPr>
+        <w:pStyle w:val="Title"/>
+        <w:jc w:val="center"/>
+        <w:rPr>
+          <w:b/>
+          <w:bCs/>
+          <w:u w:val="single"/>
+        </w:rPr>
+      </w:pPr>
+      <w:r>
+        <w:rPr>
+          <w:b/>
+          <w:bCs/>
+          <w:u w:val="single"/>
+        </w:rPr>
+        <w:t xml:space="preserve">SCP </w:t>
+      </w:r>
+      <w:r>
+        <w:rPr>
+          <w:b/>
+          <w:bCs/>
+          <w:u w:val="single"/>
+        </w:rPr>
+        <w:t xml:space="preserve">from </w:t>
+      </w:r>
+      <w:r>
+        <w:rPr>
+          <w:b/>
+          <w:bCs/>
+          <w:u w:val="single"/>
+        </w:rPr>
+        <w:t>PC</w:t>
+      </w:r>
+      <w:r>
+        <w:rPr>
+          <w:b/>
+          <w:bCs/>
+          <w:u w:val="single"/>
+        </w:rPr>
+        <w:t xml:space="preserve"> </w:t>
+      </w:r>
+      <w:r>
+        <w:rPr>
+          <w:b/>
+          <w:bCs/>
+          <w:u w:val="single"/>
+        </w:rPr>
+        <w:t>(</w:t>
+      </w:r>
+      <w:proofErr w:type="gramStart"/>
+      <w:r>
+        <w:rPr>
+          <w:b/>
+          <w:bCs/>
+          <w:u w:val="single"/>
+        </w:rPr>
+        <w:t>Update .env</w:t>
+      </w:r>
+      <w:proofErr w:type="gramEnd"/>
+      <w:r>
+        <w:rPr>
+          <w:b/>
+          <w:bCs/>
+          <w:u w:val="single"/>
+        </w:rPr>
+        <w:t xml:space="preserve"> File</w:t>
+      </w:r>
+      <w:r>
+        <w:rPr>
+          <w:b/>
+          <w:bCs/>
+          <w:u w:val="single"/>
+        </w:rPr>
+        <w:t>)</w:t>
+      </w:r>
+    </w:p>
+    <w:p/>
+    <w:p>
+      <w:proofErr w:type="spellStart"/>
+      <w:proofErr w:type="gramStart"/>
+      <w:r>
+        <w:t>scp</w:t>
+      </w:r>
+      <w:proofErr w:type="spellEnd"/>
+      <w:r>
+        <w:t xml:space="preserve"> .</w:t>
+      </w:r>
+      <w:proofErr w:type="gramEnd"/>
+      <w:r>
+        <w:t>\.</w:t>
+      </w:r>
+      <w:proofErr w:type="gramStart"/>
+      <w:r>
+        <w:t>env  localadmin@192.168.85.130</w:t>
+      </w:r>
+      <w:proofErr w:type="gramEnd"/>
       <w:r>
         <w:t>:/home/</w:t>
       </w:r>
@@ -1231,11 +1377,12 @@
         <w:t>fyp</w:t>
       </w:r>
       <w:proofErr w:type="spellEnd"/>
-      <w:r>
-        <w:t>/*.csv D:\</w:t>
-      </w:r>
-    </w:p>
-    <w:p/>
+      <w:proofErr w:type="gramStart"/>
+      <w:r>
+        <w:t>/.env</w:t>
+      </w:r>
+      <w:proofErr w:type="gramEnd"/>
+    </w:p>
     <w:sectPr>
       <w:pgSz w:w="11906" w:h="16838"/>
       <w:pgMar w:top="1440" w:right="1440" w:bottom="1440" w:left="1440" w:header="720" w:footer="720" w:gutter="0"/>

</xml_diff>

<commit_message>
Update : VM Note
</commit_message>
<xml_diff>
--- a/vm_note.docx
+++ b/vm_note.docx
@@ -219,77 +219,20 @@
     <w:p/>
     <w:p>
       <w:r>
-        <w:t xml:space="preserve">python3 -m </w:t>
-      </w:r>
-      <w:proofErr w:type="spellStart"/>
-      <w:proofErr w:type="gramStart"/>
-      <w:r>
-        <w:t>http.server</w:t>
-      </w:r>
-      <w:proofErr w:type="spellEnd"/>
-      <w:proofErr w:type="gramEnd"/>
-      <w:r>
-        <w:t xml:space="preserve"> &amp;</w:t>
-      </w:r>
-    </w:p>
-    <w:p>
-      <w:proofErr w:type="spellStart"/>
-      <w:r>
-        <w:t>openssl</w:t>
-      </w:r>
-      <w:proofErr w:type="spellEnd"/>
-      <w:r>
-        <w:t xml:space="preserve"> </w:t>
-      </w:r>
-      <w:proofErr w:type="spellStart"/>
-      <w:r>
-        <w:t>s_server</w:t>
-      </w:r>
-      <w:proofErr w:type="spellEnd"/>
-      <w:r>
-        <w:t xml:space="preserve"> -accept 443 -cert </w:t>
-      </w:r>
-      <w:proofErr w:type="spellStart"/>
-      <w:r>
-        <w:t>cert.pem</w:t>
-      </w:r>
-      <w:proofErr w:type="spellEnd"/>
-      <w:r>
-        <w:t xml:space="preserve"> -key </w:t>
-      </w:r>
-      <w:proofErr w:type="spellStart"/>
-      <w:r>
-        <w:t>key.pem</w:t>
-      </w:r>
-      <w:proofErr w:type="spellEnd"/>
-      <w:r>
-        <w:t xml:space="preserve"> -www &amp;</w:t>
-      </w:r>
-    </w:p>
-    <w:p>
-      <w:proofErr w:type="spellStart"/>
-      <w:r>
-        <w:t>sudo</w:t>
-      </w:r>
-      <w:proofErr w:type="spellEnd"/>
-      <w:r>
-        <w:t xml:space="preserve"> </w:t>
-      </w:r>
-      <w:proofErr w:type="spellStart"/>
-      <w:r>
-        <w:t>nc</w:t>
-      </w:r>
-      <w:proofErr w:type="spellEnd"/>
-      <w:r>
-        <w:t xml:space="preserve"> -</w:t>
-      </w:r>
-      <w:proofErr w:type="spellStart"/>
-      <w:r>
-        <w:t>lkp</w:t>
-      </w:r>
-      <w:proofErr w:type="spellEnd"/>
-      <w:r>
-        <w:t xml:space="preserve"> 445</w:t>
+        <w:t>python3 -m http.server &amp;</w:t>
+      </w:r>
+    </w:p>
+    <w:p>
+      <w:r>
+        <w:t>openssl s_server -accept 443 -cert cert.pem -key key.pem -www &amp;</w:t>
+      </w:r>
+    </w:p>
+    <w:p>
+      <w:r>
+        <w:t xml:space="preserve">sudo </w:t>
+      </w:r>
+      <w:r>
+        <w:t>nc -lkp 445</w:t>
       </w:r>
     </w:p>
     <w:tbl>
@@ -318,86 +261,22 @@
           </w:p>
           <w:p>
             <w:r>
-              <w:t xml:space="preserve">  ssh -o </w:t>
-            </w:r>
-            <w:proofErr w:type="spellStart"/>
-            <w:r>
-              <w:t>BatchMode</w:t>
-            </w:r>
-            <w:proofErr w:type="spellEnd"/>
-            <w:r>
-              <w:t xml:space="preserve">=yes -o </w:t>
-            </w:r>
-            <w:proofErr w:type="spellStart"/>
-            <w:r>
-              <w:t>ConnectTimeout</w:t>
-            </w:r>
-            <w:proofErr w:type="spellEnd"/>
-            <w:r>
-              <w:t>=1 -b 10.0.10.1 localadmin@10.0.10.2 exit &amp;</w:t>
-            </w:r>
-          </w:p>
-          <w:p>
-            <w:r>
-              <w:t xml:space="preserve">  ssh -o </w:t>
-            </w:r>
-            <w:proofErr w:type="spellStart"/>
-            <w:r>
-              <w:t>BatchMode</w:t>
-            </w:r>
-            <w:proofErr w:type="spellEnd"/>
-            <w:r>
-              <w:t xml:space="preserve">=yes -o </w:t>
-            </w:r>
-            <w:proofErr w:type="spellStart"/>
-            <w:r>
-              <w:t>ConnectTimeout</w:t>
-            </w:r>
-            <w:proofErr w:type="spellEnd"/>
-            <w:r>
-              <w:t>=1 -b 10.0.20.1 localadmin@10.0.20.2 exit &amp;</w:t>
-            </w:r>
-          </w:p>
-          <w:p>
-            <w:r>
-              <w:t xml:space="preserve">  ssh -o </w:t>
-            </w:r>
-            <w:proofErr w:type="spellStart"/>
-            <w:r>
-              <w:t>BatchMode</w:t>
-            </w:r>
-            <w:proofErr w:type="spellEnd"/>
-            <w:r>
-              <w:t xml:space="preserve">=yes -o </w:t>
-            </w:r>
-            <w:proofErr w:type="spellStart"/>
-            <w:r>
-              <w:t>ConnectTimeout</w:t>
-            </w:r>
-            <w:proofErr w:type="spellEnd"/>
-            <w:r>
-              <w:t>=1 -b 10.0.30.1 localadmin@10.0.30.2 exit &amp;</w:t>
-            </w:r>
-          </w:p>
-          <w:p>
-            <w:r>
-              <w:t xml:space="preserve">  ssh -o </w:t>
-            </w:r>
-            <w:proofErr w:type="spellStart"/>
-            <w:r>
-              <w:t>BatchMode</w:t>
-            </w:r>
-            <w:proofErr w:type="spellEnd"/>
-            <w:r>
-              <w:t xml:space="preserve">=yes -o </w:t>
-            </w:r>
-            <w:proofErr w:type="spellStart"/>
-            <w:r>
-              <w:t>ConnectTimeout</w:t>
-            </w:r>
-            <w:proofErr w:type="spellEnd"/>
-            <w:r>
-              <w:t>=1 -b 10.0.40.1 localadmin@10.0.40.2 exit &amp;</w:t>
+              <w:t xml:space="preserve">  ssh -o BatchMode=yes -o ConnectTimeout=1 -b 10.0.10.1 localadmin@10.0.10.2 exit &amp;</w:t>
+            </w:r>
+          </w:p>
+          <w:p>
+            <w:r>
+              <w:t xml:space="preserve">  ssh -o BatchMode=yes -o ConnectTimeout=1 -b 10.0.20.1 localadmin@10.0.20.2 exit &amp;</w:t>
+            </w:r>
+          </w:p>
+          <w:p>
+            <w:r>
+              <w:t xml:space="preserve">  ssh -o BatchMode=yes -o ConnectTimeout=1 -b 10.0.30.1 localadmin@10.0.30.2 exit &amp;</w:t>
+            </w:r>
+          </w:p>
+          <w:p>
+            <w:r>
+              <w:t xml:space="preserve">  ssh -o BatchMode=yes -o ConnectTimeout=1 -b 10.0.40.1 localadmin@10.0.40.2 exit &amp;</w:t>
             </w:r>
           </w:p>
           <w:p/>
@@ -458,54 +337,22 @@
           </w:p>
           <w:p>
             <w:r>
-              <w:t xml:space="preserve">  curl -</w:t>
-            </w:r>
-            <w:proofErr w:type="spellStart"/>
-            <w:r>
-              <w:t>sk</w:t>
-            </w:r>
-            <w:proofErr w:type="spellEnd"/>
-            <w:r>
-              <w:t xml:space="preserve"> --connect-timeout 1 https://10.0.10.2 &gt;/dev/null &amp;</w:t>
-            </w:r>
-          </w:p>
-          <w:p>
-            <w:r>
-              <w:t xml:space="preserve">  curl -</w:t>
-            </w:r>
-            <w:proofErr w:type="spellStart"/>
-            <w:r>
-              <w:t>sk</w:t>
-            </w:r>
-            <w:proofErr w:type="spellEnd"/>
-            <w:r>
-              <w:t xml:space="preserve"> --connect-timeout 1 https://10.0.20.2 &gt;/dev/null &amp;</w:t>
-            </w:r>
-          </w:p>
-          <w:p>
-            <w:r>
-              <w:t xml:space="preserve">  curl -</w:t>
-            </w:r>
-            <w:proofErr w:type="spellStart"/>
-            <w:r>
-              <w:t>sk</w:t>
-            </w:r>
-            <w:proofErr w:type="spellEnd"/>
-            <w:r>
-              <w:t xml:space="preserve"> --connect-timeout 1 https://10.0.30.2 &gt;/dev/null &amp;</w:t>
-            </w:r>
-          </w:p>
-          <w:p>
-            <w:r>
-              <w:t xml:space="preserve">  curl -</w:t>
-            </w:r>
-            <w:proofErr w:type="spellStart"/>
-            <w:r>
-              <w:t>sk</w:t>
-            </w:r>
-            <w:proofErr w:type="spellEnd"/>
-            <w:r>
-              <w:t xml:space="preserve"> --connect-timeout 1 https://10.0.40.2 &gt;/dev/null &amp;</w:t>
+              <w:t xml:space="preserve">  curl -sk --connect-timeout 1 https://10.0.10.2 &gt;/dev/null &amp;</w:t>
+            </w:r>
+          </w:p>
+          <w:p>
+            <w:r>
+              <w:t xml:space="preserve">  curl -sk --connect-timeout 1 https://10.0.20.2 &gt;/dev/null &amp;</w:t>
+            </w:r>
+          </w:p>
+          <w:p>
+            <w:r>
+              <w:t xml:space="preserve">  curl -sk --connect-timeout 1 https://10.0.30.2 &gt;/dev/null &amp;</w:t>
+            </w:r>
+          </w:p>
+          <w:p>
+            <w:r>
+              <w:t xml:space="preserve">  curl -sk --connect-timeout 1 https://10.0.40.2 &gt;/dev/null &amp;</w:t>
             </w:r>
           </w:p>
           <w:p>
@@ -529,28 +376,12 @@
           </w:p>
           <w:p>
             <w:r>
-              <w:t xml:space="preserve">     -H "Content-Type: application/</w:t>
-            </w:r>
-            <w:proofErr w:type="spellStart"/>
-            <w:r>
-              <w:t>json</w:t>
-            </w:r>
-            <w:proofErr w:type="spellEnd"/>
-            <w:r>
-              <w:t>" \</w:t>
-            </w:r>
-          </w:p>
-          <w:p>
-            <w:r>
-              <w:t xml:space="preserve">     -d '{"</w:t>
-            </w:r>
-            <w:proofErr w:type="spellStart"/>
-            <w:r>
-              <w:t>event":"test</w:t>
-            </w:r>
-            <w:proofErr w:type="spellEnd"/>
-            <w:r>
-              <w:t>"}' &gt;/dev/null &amp;</w:t>
+              <w:t xml:space="preserve">     -H "Content-Type: application/json" \</w:t>
+            </w:r>
+          </w:p>
+          <w:p>
+            <w:r>
+              <w:t xml:space="preserve">     -d '{"event":"test"}' &gt;/dev/null &amp;</w:t>
             </w:r>
           </w:p>
           <w:p>
@@ -592,60 +423,31 @@
           </w:p>
           <w:p>
             <w:r>
-              <w:t xml:space="preserve">  echo test | </w:t>
-            </w:r>
-            <w:proofErr w:type="spellStart"/>
-            <w:r>
-              <w:t>nc</w:t>
-            </w:r>
-            <w:proofErr w:type="spellEnd"/>
-            <w:r>
-              <w:t xml:space="preserve"> -w1 10.0.10.2 445 &amp;</w:t>
-            </w:r>
-          </w:p>
-          <w:p>
-            <w:r>
-              <w:t xml:space="preserve">  echo test | </w:t>
-            </w:r>
-            <w:proofErr w:type="spellStart"/>
-            <w:r>
-              <w:t>nc</w:t>
-            </w:r>
-            <w:proofErr w:type="spellEnd"/>
-            <w:r>
-              <w:t xml:space="preserve"> -w1 10.0.20.2 445 &amp;</w:t>
-            </w:r>
-          </w:p>
-          <w:p>
-            <w:r>
-              <w:t xml:space="preserve">  echo test | </w:t>
-            </w:r>
-            <w:proofErr w:type="spellStart"/>
-            <w:r>
-              <w:t>nc</w:t>
-            </w:r>
-            <w:proofErr w:type="spellEnd"/>
-            <w:r>
-              <w:t xml:space="preserve"> -w1 10.0.30.2 445 &amp;</w:t>
-            </w:r>
-          </w:p>
-          <w:p>
-            <w:r>
-              <w:t xml:space="preserve">  echo test | </w:t>
-            </w:r>
-            <w:proofErr w:type="spellStart"/>
-            <w:r>
-              <w:t>nc</w:t>
-            </w:r>
-            <w:proofErr w:type="spellEnd"/>
-            <w:r>
-              <w:t xml:space="preserve"> -w1 10.0.40.2 445 &amp;</w:t>
+              <w:t xml:space="preserve">  echo test | nc -w1 10.0.10.2 445 &amp;</w:t>
+            </w:r>
+          </w:p>
+          <w:p>
+            <w:r>
+              <w:t xml:space="preserve">  echo test | nc -w1 10.0.20.2 445 &amp;</w:t>
+            </w:r>
+          </w:p>
+          <w:p>
+            <w:r>
+              <w:t xml:space="preserve">  echo test | nc -w1 10.0.30.2 445 &amp;</w:t>
+            </w:r>
+          </w:p>
+          <w:p>
+            <w:r>
+              <w:t xml:space="preserve">  echo test | nc -w1 10.0.40.2 445 &amp;</w:t>
             </w:r>
           </w:p>
           <w:p/>
           <w:p>
             <w:r>
-              <w:t xml:space="preserve">  sleep 0.2</w:t>
+              <w:t xml:space="preserve">  sleep 0.</w:t>
+            </w:r>
+            <w:r>
+              <w:t>5</w:t>
             </w:r>
           </w:p>
           <w:p>
@@ -680,120 +482,31 @@
     <w:p/>
     <w:p>
       <w:r>
-        <w:t>cd /home/</w:t>
-      </w:r>
-      <w:proofErr w:type="spellStart"/>
-      <w:r>
-        <w:t>localadmin</w:t>
-      </w:r>
-      <w:proofErr w:type="spellEnd"/>
-      <w:r>
-        <w:t>/</w:t>
-      </w:r>
-      <w:r>
-        <w:t>packet-</w:t>
-      </w:r>
-      <w:proofErr w:type="spellStart"/>
-      <w:r>
-        <w:t>header_n_frame</w:t>
-      </w:r>
-      <w:proofErr w:type="spellEnd"/>
-      <w:r>
-        <w:t>-analysis</w:t>
-      </w:r>
-    </w:p>
-    <w:p>
-      <w:proofErr w:type="spellStart"/>
-      <w:r>
-        <w:t>sudo</w:t>
-      </w:r>
-      <w:proofErr w:type="spellEnd"/>
-      <w:r>
-        <w:t xml:space="preserve"> -E ~/</w:t>
-      </w:r>
-      <w:proofErr w:type="spellStart"/>
-      <w:r>
-        <w:t>vlanlab</w:t>
-      </w:r>
-      <w:proofErr w:type="spellEnd"/>
-      <w:r>
-        <w:t>/bin/python fyp1.py</w:t>
+        <w:t>cd /home/localadmin/</w:t>
+      </w:r>
+      <w:r>
+        <w:t>packet-header_n_frame-analysis</w:t>
+      </w:r>
+    </w:p>
+    <w:p>
+      <w:r>
+        <w:t>sudo -E ~/vlanlab/bin/python fyp1.py</w:t>
       </w:r>
     </w:p>
     <w:p/>
     <w:p>
       <w:r>
-        <w:t xml:space="preserve">python3 -m </w:t>
-      </w:r>
-      <w:proofErr w:type="spellStart"/>
-      <w:proofErr w:type="gramStart"/>
-      <w:r>
-        <w:t>http.server</w:t>
-      </w:r>
-      <w:proofErr w:type="spellEnd"/>
-      <w:proofErr w:type="gramEnd"/>
-      <w:r>
-        <w:t xml:space="preserve"> 8080 &amp;</w:t>
-      </w:r>
-    </w:p>
-    <w:p>
-      <w:proofErr w:type="spellStart"/>
-      <w:r>
-        <w:t>openssl</w:t>
-      </w:r>
-      <w:proofErr w:type="spellEnd"/>
-      <w:r>
-        <w:t xml:space="preserve"> </w:t>
-      </w:r>
-      <w:proofErr w:type="spellStart"/>
-      <w:r>
-        <w:t>s_server</w:t>
-      </w:r>
-      <w:proofErr w:type="spellEnd"/>
-      <w:r>
-        <w:t xml:space="preserve"> -accept 443 -cert </w:t>
-      </w:r>
-      <w:proofErr w:type="spellStart"/>
-      <w:r>
-        <w:t>cert.pem</w:t>
-      </w:r>
-      <w:proofErr w:type="spellEnd"/>
-      <w:r>
-        <w:t xml:space="preserve"> -key </w:t>
-      </w:r>
-      <w:proofErr w:type="spellStart"/>
-      <w:r>
-        <w:t>key.pem</w:t>
-      </w:r>
-      <w:proofErr w:type="spellEnd"/>
-      <w:r>
-        <w:t xml:space="preserve"> -www &amp;</w:t>
-      </w:r>
-    </w:p>
-    <w:p>
-      <w:proofErr w:type="spellStart"/>
-      <w:r>
-        <w:t>sudo</w:t>
-      </w:r>
-      <w:proofErr w:type="spellEnd"/>
-      <w:r>
-        <w:t xml:space="preserve"> </w:t>
-      </w:r>
-      <w:proofErr w:type="spellStart"/>
-      <w:r>
-        <w:t>nc</w:t>
-      </w:r>
-      <w:proofErr w:type="spellEnd"/>
-      <w:r>
-        <w:t xml:space="preserve"> -</w:t>
-      </w:r>
-      <w:proofErr w:type="spellStart"/>
-      <w:r>
-        <w:t>lkp</w:t>
-      </w:r>
-      <w:proofErr w:type="spellEnd"/>
-      <w:r>
-        <w:t xml:space="preserve"> 445</w:t>
+        <w:t>python3 -m http.server 8080 &amp;</w:t>
+      </w:r>
+    </w:p>
+    <w:p>
+      <w:r>
+        <w:t>openssl s_server -accept 443 -cert cert.pem -key key.pem -www &amp;</w:t>
+      </w:r>
+    </w:p>
+    <w:p>
+      <w:r>
+        <w:t>sudo nc -lkp 445</w:t>
       </w:r>
     </w:p>
     <w:tbl>
@@ -825,86 +538,22 @@
           </w:p>
           <w:p>
             <w:r>
-              <w:t xml:space="preserve">  ssh -o </w:t>
-            </w:r>
-            <w:proofErr w:type="spellStart"/>
-            <w:r>
-              <w:t>BatchMode</w:t>
-            </w:r>
-            <w:proofErr w:type="spellEnd"/>
-            <w:r>
-              <w:t xml:space="preserve">=yes -o </w:t>
-            </w:r>
-            <w:proofErr w:type="spellStart"/>
-            <w:r>
-              <w:t>ConnectTimeout</w:t>
-            </w:r>
-            <w:proofErr w:type="spellEnd"/>
-            <w:r>
-              <w:t>=1 -b 10.0.10.2 localadmin@10.0.10.1 exit &amp;</w:t>
-            </w:r>
-          </w:p>
-          <w:p>
-            <w:r>
-              <w:t xml:space="preserve">  ssh -o </w:t>
-            </w:r>
-            <w:proofErr w:type="spellStart"/>
-            <w:r>
-              <w:t>BatchMode</w:t>
-            </w:r>
-            <w:proofErr w:type="spellEnd"/>
-            <w:r>
-              <w:t xml:space="preserve">=yes -o </w:t>
-            </w:r>
-            <w:proofErr w:type="spellStart"/>
-            <w:r>
-              <w:t>ConnectTimeout</w:t>
-            </w:r>
-            <w:proofErr w:type="spellEnd"/>
-            <w:r>
-              <w:t>=1 -b 10.0.20.2 localadmin@10.0.20.1 exit &amp;</w:t>
-            </w:r>
-          </w:p>
-          <w:p>
-            <w:r>
-              <w:t xml:space="preserve">  ssh -o </w:t>
-            </w:r>
-            <w:proofErr w:type="spellStart"/>
-            <w:r>
-              <w:t>BatchMode</w:t>
-            </w:r>
-            <w:proofErr w:type="spellEnd"/>
-            <w:r>
-              <w:t xml:space="preserve">=yes -o </w:t>
-            </w:r>
-            <w:proofErr w:type="spellStart"/>
-            <w:r>
-              <w:t>ConnectTimeout</w:t>
-            </w:r>
-            <w:proofErr w:type="spellEnd"/>
-            <w:r>
-              <w:t>=1 -b 10.0.30.2 localadmin@10.0.30.1 exit &amp;</w:t>
-            </w:r>
-          </w:p>
-          <w:p>
-            <w:r>
-              <w:t xml:space="preserve">  ssh -o </w:t>
-            </w:r>
-            <w:proofErr w:type="spellStart"/>
-            <w:r>
-              <w:t>BatchMode</w:t>
-            </w:r>
-            <w:proofErr w:type="spellEnd"/>
-            <w:r>
-              <w:t xml:space="preserve">=yes -o </w:t>
-            </w:r>
-            <w:proofErr w:type="spellStart"/>
-            <w:r>
-              <w:t>ConnectTimeout</w:t>
-            </w:r>
-            <w:proofErr w:type="spellEnd"/>
-            <w:r>
-              <w:t>=1 -b 10.0.40.2 localadmin@10.0.40.1 exit &amp;</w:t>
+              <w:t xml:space="preserve">  ssh -o BatchMode=yes -o ConnectTimeout=1 -b 10.0.10.2 localadmin@10.0.10.1 exit &amp;</w:t>
+            </w:r>
+          </w:p>
+          <w:p>
+            <w:r>
+              <w:t xml:space="preserve">  ssh -o BatchMode=yes -o ConnectTimeout=1 -b 10.0.20.2 localadmin@10.0.20.1 exit &amp;</w:t>
+            </w:r>
+          </w:p>
+          <w:p>
+            <w:r>
+              <w:t xml:space="preserve">  ssh -o BatchMode=yes -o ConnectTimeout=1 -b 10.0.30.2 localadmin@10.0.30.1 exit &amp;</w:t>
+            </w:r>
+          </w:p>
+          <w:p>
+            <w:r>
+              <w:t xml:space="preserve">  ssh -o BatchMode=yes -o ConnectTimeout=1 -b 10.0.40.2 localadmin@10.0.40.1 exit &amp;</w:t>
             </w:r>
           </w:p>
           <w:p/>
@@ -947,54 +596,22 @@
           </w:p>
           <w:p>
             <w:r>
-              <w:t xml:space="preserve">  curl -</w:t>
-            </w:r>
-            <w:proofErr w:type="spellStart"/>
-            <w:r>
-              <w:t>sk</w:t>
-            </w:r>
-            <w:proofErr w:type="spellEnd"/>
-            <w:r>
-              <w:t xml:space="preserve"> --connect-timeout 1 https://10.0.10.1 &gt;/dev/null &amp;</w:t>
-            </w:r>
-          </w:p>
-          <w:p>
-            <w:r>
-              <w:t xml:space="preserve">  curl -</w:t>
-            </w:r>
-            <w:proofErr w:type="spellStart"/>
-            <w:r>
-              <w:t>sk</w:t>
-            </w:r>
-            <w:proofErr w:type="spellEnd"/>
-            <w:r>
-              <w:t xml:space="preserve"> --connect-timeout 1 https://10.0.20.1 &gt;/dev/null &amp;</w:t>
-            </w:r>
-          </w:p>
-          <w:p>
-            <w:r>
-              <w:t xml:space="preserve">  curl -</w:t>
-            </w:r>
-            <w:proofErr w:type="spellStart"/>
-            <w:r>
-              <w:t>sk</w:t>
-            </w:r>
-            <w:proofErr w:type="spellEnd"/>
-            <w:r>
-              <w:t xml:space="preserve"> --connect-timeout 1 https://10.0.30.1 &gt;/dev/null &amp;</w:t>
-            </w:r>
-          </w:p>
-          <w:p>
-            <w:r>
-              <w:t xml:space="preserve">  curl -</w:t>
-            </w:r>
-            <w:proofErr w:type="spellStart"/>
-            <w:r>
-              <w:t>sk</w:t>
-            </w:r>
-            <w:proofErr w:type="spellEnd"/>
-            <w:r>
-              <w:t xml:space="preserve"> --connect-timeout 1 https://10.0.40.1 &gt;/dev/null &amp;</w:t>
+              <w:t xml:space="preserve">  curl -sk --connect-timeout 1 https://10.0.10.1 &gt;/dev/null &amp;</w:t>
+            </w:r>
+          </w:p>
+          <w:p>
+            <w:r>
+              <w:t xml:space="preserve">  curl -sk --connect-timeout 1 https://10.0.20.1 &gt;/dev/null &amp;</w:t>
+            </w:r>
+          </w:p>
+          <w:p>
+            <w:r>
+              <w:t xml:space="preserve">  curl -sk --connect-timeout 1 https://10.0.30.1 &gt;/dev/null &amp;</w:t>
+            </w:r>
+          </w:p>
+          <w:p>
+            <w:r>
+              <w:t xml:space="preserve">  curl -sk --connect-timeout 1 https://10.0.40.1 &gt;/dev/null &amp;</w:t>
             </w:r>
           </w:p>
           <w:p>
@@ -1018,28 +635,12 @@
           </w:p>
           <w:p>
             <w:r>
-              <w:t xml:space="preserve">     -H "Content-Type: application/</w:t>
-            </w:r>
-            <w:proofErr w:type="spellStart"/>
-            <w:r>
-              <w:t>json</w:t>
-            </w:r>
-            <w:proofErr w:type="spellEnd"/>
-            <w:r>
-              <w:t>" \</w:t>
-            </w:r>
-          </w:p>
-          <w:p>
-            <w:r>
-              <w:t xml:space="preserve">     -d '{"</w:t>
-            </w:r>
-            <w:proofErr w:type="spellStart"/>
-            <w:r>
-              <w:t>event":"test</w:t>
-            </w:r>
-            <w:proofErr w:type="spellEnd"/>
-            <w:r>
-              <w:t>"}' &gt;/dev/null &amp;</w:t>
+              <w:t xml:space="preserve">     -H "Content-Type: application/json" \</w:t>
+            </w:r>
+          </w:p>
+          <w:p>
+            <w:r>
+              <w:t xml:space="preserve">     -d '{"event":"test"}' &gt;/dev/null &amp;</w:t>
             </w:r>
           </w:p>
           <w:p>
@@ -1084,61 +685,32 @@
           </w:p>
           <w:p>
             <w:r>
-              <w:t xml:space="preserve">  echo test | </w:t>
-            </w:r>
-            <w:proofErr w:type="spellStart"/>
-            <w:r>
-              <w:t>nc</w:t>
-            </w:r>
-            <w:proofErr w:type="spellEnd"/>
-            <w:r>
-              <w:t xml:space="preserve"> -w1 10.0.10.1 445 &amp;</w:t>
-            </w:r>
-          </w:p>
-          <w:p>
-            <w:r>
-              <w:t xml:space="preserve">  echo test | </w:t>
-            </w:r>
-            <w:proofErr w:type="spellStart"/>
-            <w:r>
-              <w:t>nc</w:t>
-            </w:r>
-            <w:proofErr w:type="spellEnd"/>
-            <w:r>
-              <w:t xml:space="preserve"> -w1 10.0.20.1 445 &amp;</w:t>
-            </w:r>
-          </w:p>
-          <w:p>
-            <w:r>
-              <w:t xml:space="preserve">  echo test | </w:t>
-            </w:r>
-            <w:proofErr w:type="spellStart"/>
-            <w:r>
-              <w:t>nc</w:t>
-            </w:r>
-            <w:proofErr w:type="spellEnd"/>
-            <w:r>
-              <w:t xml:space="preserve"> -w1 10.0.30.1 445 &amp;</w:t>
+              <w:t xml:space="preserve">  echo test | nc -w1 10.0.10.1 445 &amp;</w:t>
+            </w:r>
+          </w:p>
+          <w:p>
+            <w:r>
+              <w:t xml:space="preserve">  echo test | nc -w1 10.0.20.1 445 &amp;</w:t>
+            </w:r>
+          </w:p>
+          <w:p>
+            <w:r>
+              <w:t xml:space="preserve">  echo test | nc -w1 10.0.30.1 445 &amp;</w:t>
             </w:r>
           </w:p>
           <w:p>
             <w:r>
               <w:lastRenderedPageBreak/>
-              <w:t xml:space="preserve">  echo test | </w:t>
-            </w:r>
-            <w:proofErr w:type="spellStart"/>
-            <w:r>
-              <w:t>nc</w:t>
-            </w:r>
-            <w:proofErr w:type="spellEnd"/>
-            <w:r>
-              <w:t xml:space="preserve"> -w1 10.0.40.1 445 &amp;</w:t>
+              <w:t xml:space="preserve">  echo test | nc -w1 10.0.40.1 445 &amp;</w:t>
             </w:r>
           </w:p>
           <w:p/>
           <w:p>
             <w:r>
-              <w:t xml:space="preserve">  sleep 0.2</w:t>
+              <w:t xml:space="preserve">  sleep 0.</w:t>
+            </w:r>
+            <w:r>
+              <w:t>5</w:t>
             </w:r>
           </w:p>
           <w:p>
@@ -1158,44 +730,15 @@
     </w:p>
     <w:p>
       <w:r>
-        <w:t>cd /home/</w:t>
-      </w:r>
-      <w:proofErr w:type="spellStart"/>
-      <w:r>
-        <w:t>localadmin</w:t>
-      </w:r>
-      <w:proofErr w:type="spellEnd"/>
-      <w:r>
-        <w:t>/</w:t>
-      </w:r>
-      <w:r>
-        <w:t>packet-</w:t>
-      </w:r>
-      <w:proofErr w:type="spellStart"/>
-      <w:r>
-        <w:t>header_n_frame</w:t>
-      </w:r>
-      <w:proofErr w:type="spellEnd"/>
-      <w:r>
-        <w:t>-analysis</w:t>
-      </w:r>
-    </w:p>
-    <w:p>
-      <w:proofErr w:type="spellStart"/>
-      <w:r>
-        <w:t>sudo</w:t>
-      </w:r>
-      <w:proofErr w:type="spellEnd"/>
-      <w:r>
-        <w:t xml:space="preserve"> -E ~/</w:t>
-      </w:r>
-      <w:proofErr w:type="spellStart"/>
-      <w:r>
-        <w:t>vlanlab</w:t>
-      </w:r>
-      <w:proofErr w:type="spellEnd"/>
-      <w:r>
-        <w:t>/bin/python app.py</w:t>
+        <w:t>cd /home/localadmin/</w:t>
+      </w:r>
+      <w:r>
+        <w:t>packet-header_n_frame-analysis</w:t>
+      </w:r>
+    </w:p>
+    <w:p>
+      <w:r>
+        <w:t>sudo -E ~/vlanlab/bin/python app.py</w:t>
       </w:r>
     </w:p>
     <w:p/>
@@ -1259,118 +802,91 @@
           <w:szCs w:val="22"/>
         </w:rPr>
       </w:pPr>
-      <w:proofErr w:type="spellStart"/>
       <w:r>
         <w:rPr>
           <w:sz w:val="22"/>
           <w:szCs w:val="22"/>
         </w:rPr>
-        <w:t>scp</w:t>
-      </w:r>
-      <w:proofErr w:type="spellEnd"/>
+        <w:t>scp localadmin@192.168.85.130:/home/localadmin/</w:t>
+      </w:r>
       <w:r>
         <w:rPr>
           <w:sz w:val="22"/>
           <w:szCs w:val="22"/>
         </w:rPr>
-        <w:t xml:space="preserve"> localadmin@192.168.85.130:/home/localadmin/</w:t>
+        <w:t>packet-header_n_frame-analysis</w:t>
       </w:r>
       <w:r>
         <w:rPr>
           <w:sz w:val="22"/>
           <w:szCs w:val="22"/>
         </w:rPr>
-        <w:t>packet-header_n_frame-analysis</w:t>
+        <w:t xml:space="preserve">/*.csv </w:t>
       </w:r>
       <w:r>
         <w:rPr>
           <w:sz w:val="22"/>
           <w:szCs w:val="22"/>
         </w:rPr>
-        <w:t xml:space="preserve">/*.csv </w:t>
-      </w:r>
-      <w:r>
+        <w:t>"D:/"</w:t>
+      </w:r>
+    </w:p>
+    <w:p>
+      <w:pPr>
         <w:rPr>
           <w:sz w:val="22"/>
           <w:szCs w:val="22"/>
         </w:rPr>
-        <w:t>"D:/"</w:t>
-      </w:r>
-    </w:p>
-    <w:p>
-      <w:pPr>
+      </w:pPr>
+      <w:r>
         <w:rPr>
           <w:sz w:val="22"/>
           <w:szCs w:val="22"/>
         </w:rPr>
-      </w:pPr>
-      <w:proofErr w:type="spellStart"/>
+        <w:t xml:space="preserve">scp </w:t>
+      </w:r>
       <w:r>
         <w:rPr>
           <w:sz w:val="22"/>
           <w:szCs w:val="22"/>
         </w:rPr>
-        <w:t>scp</w:t>
-      </w:r>
-      <w:proofErr w:type="spellEnd"/>
+        <w:t>localadmin@192.168.85.130:/home/localadmin/</w:t>
+      </w:r>
       <w:r>
         <w:rPr>
           <w:sz w:val="22"/>
           <w:szCs w:val="22"/>
         </w:rPr>
-        <w:t xml:space="preserve"> </w:t>
+        <w:t>packet-header_n_frame-analysis</w:t>
       </w:r>
       <w:r>
         <w:rPr>
           <w:sz w:val="22"/>
           <w:szCs w:val="22"/>
         </w:rPr>
-        <w:t>localadmin@192.168.85.130:/home/localadmin/</w:t>
+        <w:t xml:space="preserve">/*.txt </w:t>
       </w:r>
       <w:r>
         <w:rPr>
           <w:sz w:val="22"/>
           <w:szCs w:val="22"/>
         </w:rPr>
-        <w:t>packet-header_n_frame-analysis</w:t>
-      </w:r>
-      <w:r>
+        <w:t>"D:/"</w:t>
+      </w:r>
+    </w:p>
+    <w:p>
+      <w:pPr>
         <w:rPr>
           <w:sz w:val="22"/>
           <w:szCs w:val="22"/>
         </w:rPr>
-        <w:t xml:space="preserve">/*.txt </w:t>
-      </w:r>
+      </w:pPr>
       <w:r>
         <w:rPr>
           <w:sz w:val="22"/>
           <w:szCs w:val="22"/>
         </w:rPr>
-        <w:t>"D:/"</w:t>
-      </w:r>
-    </w:p>
-    <w:p>
-      <w:pPr>
-        <w:rPr>
-          <w:sz w:val="22"/>
-          <w:szCs w:val="22"/>
-        </w:rPr>
-      </w:pPr>
-      <w:proofErr w:type="spellStart"/>
-      <w:r>
-        <w:rPr>
-          <w:sz w:val="22"/>
-          <w:szCs w:val="22"/>
-        </w:rPr>
-        <w:t>scp</w:t>
-      </w:r>
-      <w:proofErr w:type="spellEnd"/>
-      <w:r>
-        <w:rPr>
-          <w:sz w:val="22"/>
-          <w:szCs w:val="22"/>
-        </w:rPr>
-        <w:t xml:space="preserve"> </w:t>
+        <w:t xml:space="preserve">scp </w:t>
       </w:r>
       <w:r>
         <w:rPr>
@@ -1429,23 +945,13 @@
         </w:rPr>
         <w:t>(</w:t>
       </w:r>
-      <w:proofErr w:type="gramStart"/>
-      <w:r>
-        <w:rPr>
-          <w:b/>
-          <w:bCs/>
-          <w:u w:val="single"/>
-        </w:rPr>
-        <w:t>Update .env</w:t>
-      </w:r>
-      <w:proofErr w:type="gramEnd"/>
-      <w:r>
-        <w:rPr>
-          <w:b/>
-          <w:bCs/>
-          <w:u w:val="single"/>
-        </w:rPr>
-        <w:t xml:space="preserve"> File</w:t>
+      <w:r>
+        <w:rPr>
+          <w:b/>
+          <w:bCs/>
+          <w:u w:val="single"/>
+        </w:rPr>
+        <w:t>Update .env File</w:t>
       </w:r>
       <w:r>
         <w:rPr>
@@ -1464,63 +970,27 @@
           <w:szCs w:val="22"/>
         </w:rPr>
       </w:pPr>
-      <w:proofErr w:type="spellStart"/>
-      <w:proofErr w:type="gramStart"/>
       <w:r>
         <w:rPr>
           <w:sz w:val="22"/>
           <w:szCs w:val="22"/>
         </w:rPr>
-        <w:t>scp</w:t>
-      </w:r>
-      <w:proofErr w:type="spellEnd"/>
+        <w:t>scp .\.env  localadmin@192.168.85.130:/home/localadmin/</w:t>
+      </w:r>
       <w:r>
         <w:rPr>
           <w:sz w:val="22"/>
           <w:szCs w:val="22"/>
         </w:rPr>
-        <w:t xml:space="preserve"> .</w:t>
-      </w:r>
-      <w:proofErr w:type="gramEnd"/>
+        <w:t>packet-header_n_frame-analysis</w:t>
+      </w:r>
       <w:r>
         <w:rPr>
           <w:sz w:val="22"/>
           <w:szCs w:val="22"/>
         </w:rPr>
-        <w:t>\.</w:t>
-      </w:r>
-      <w:proofErr w:type="gramStart"/>
-      <w:r>
-        <w:rPr>
-          <w:sz w:val="22"/>
-          <w:szCs w:val="22"/>
-        </w:rPr>
-        <w:t>env  localadmin@192.168.85.130</w:t>
-      </w:r>
-      <w:proofErr w:type="gramEnd"/>
-      <w:r>
-        <w:rPr>
-          <w:sz w:val="22"/>
-          <w:szCs w:val="22"/>
-        </w:rPr>
-        <w:t>:/home/localadmin/</w:t>
-      </w:r>
-      <w:r>
-        <w:rPr>
-          <w:sz w:val="22"/>
-          <w:szCs w:val="22"/>
-        </w:rPr>
-        <w:t>packet-header_n_frame-analysis</w:t>
-      </w:r>
-      <w:proofErr w:type="gramStart"/>
-      <w:r>
-        <w:rPr>
-          <w:sz w:val="22"/>
-          <w:szCs w:val="22"/>
-        </w:rPr>
         <w:t>/.env</w:t>
       </w:r>
-      <w:proofErr w:type="gramEnd"/>
     </w:p>
     <w:sectPr>
       <w:pgSz w:w="11906" w:h="16838"/>

</xml_diff>

<commit_message>
Updated : VM Note
</commit_message>
<xml_diff>
--- a/vm_note.docx
+++ b/vm_note.docx
@@ -218,27 +218,81 @@
     </w:p>
     <w:p/>
     <w:p>
-      <w:r>
-        <w:t xml:space="preserve">python3 -m http.server </w:t>
-      </w:r>
-      <w:r>
-        <w:t xml:space="preserve">8080 </w:t>
-      </w:r>
-      <w:r>
-        <w:t>&amp;</w:t>
-      </w:r>
-    </w:p>
-    <w:p>
-      <w:r>
-        <w:t>openssl s_server -accept 443 -cert cert.pem -key key.pem -www &amp;</w:t>
-      </w:r>
-    </w:p>
-    <w:p>
-      <w:r>
-        <w:t xml:space="preserve">sudo </w:t>
-      </w:r>
-      <w:r>
-        <w:t>nc -lkp 445</w:t>
+      <w:proofErr w:type="spellStart"/>
+      <w:r>
+        <w:t>sudo</w:t>
+      </w:r>
+      <w:proofErr w:type="spellEnd"/>
+      <w:r>
+        <w:t xml:space="preserve"> python3 -m </w:t>
+      </w:r>
+      <w:proofErr w:type="spellStart"/>
+      <w:r>
+        <w:t>http.server</w:t>
+      </w:r>
+      <w:proofErr w:type="spellEnd"/>
+      <w:r>
+        <w:t xml:space="preserve"> 80</w:t>
+      </w:r>
+    </w:p>
+    <w:p>
+      <w:proofErr w:type="spellStart"/>
+      <w:r>
+        <w:t>openssl</w:t>
+      </w:r>
+      <w:proofErr w:type="spellEnd"/>
+      <w:r>
+        <w:t xml:space="preserve"> </w:t>
+      </w:r>
+      <w:proofErr w:type="spellStart"/>
+      <w:r>
+        <w:t>s_server</w:t>
+      </w:r>
+      <w:proofErr w:type="spellEnd"/>
+      <w:r>
+        <w:t xml:space="preserve"> -accept 443 -cert </w:t>
+      </w:r>
+      <w:proofErr w:type="spellStart"/>
+      <w:r>
+        <w:t>cert.pem</w:t>
+      </w:r>
+      <w:proofErr w:type="spellEnd"/>
+      <w:r>
+        <w:t xml:space="preserve"> -key </w:t>
+      </w:r>
+      <w:proofErr w:type="spellStart"/>
+      <w:r>
+        <w:t>key.pem</w:t>
+      </w:r>
+      <w:proofErr w:type="spellEnd"/>
+      <w:r>
+        <w:t xml:space="preserve"> -www &amp;</w:t>
+      </w:r>
+    </w:p>
+    <w:p>
+      <w:proofErr w:type="spellStart"/>
+      <w:r>
+        <w:t>sudo</w:t>
+      </w:r>
+      <w:proofErr w:type="spellEnd"/>
+      <w:r>
+        <w:t xml:space="preserve"> </w:t>
+      </w:r>
+      <w:proofErr w:type="spellStart"/>
+      <w:r>
+        <w:t>nc</w:t>
+      </w:r>
+      <w:proofErr w:type="spellEnd"/>
+      <w:r>
+        <w:t xml:space="preserve"> -</w:t>
+      </w:r>
+      <w:proofErr w:type="spellStart"/>
+      <w:r>
+        <w:t>lkp</w:t>
+      </w:r>
+      <w:proofErr w:type="spellEnd"/>
+      <w:r>
+        <w:t xml:space="preserve"> 445</w:t>
       </w:r>
     </w:p>
     <w:tbl>
@@ -267,22 +321,86 @@
           </w:p>
           <w:p>
             <w:r>
-              <w:t xml:space="preserve">  ssh -o BatchMode=yes -o ConnectTimeout=1 -b 10.0.10.1 localadmin@10.0.10.2 exit &amp;</w:t>
-            </w:r>
-          </w:p>
-          <w:p>
-            <w:r>
-              <w:t xml:space="preserve">  ssh -o BatchMode=yes -o ConnectTimeout=1 -b 10.0.20.1 localadmin@10.0.20.2 exit &amp;</w:t>
-            </w:r>
-          </w:p>
-          <w:p>
-            <w:r>
-              <w:t xml:space="preserve">  ssh -o BatchMode=yes -o ConnectTimeout=1 -b 10.0.30.1 localadmin@10.0.30.2 exit &amp;</w:t>
-            </w:r>
-          </w:p>
-          <w:p>
-            <w:r>
-              <w:t xml:space="preserve">  ssh -o BatchMode=yes -o ConnectTimeout=1 -b 10.0.40.1 localadmin@10.0.40.2 exit &amp;</w:t>
+              <w:t xml:space="preserve">  ssh -o </w:t>
+            </w:r>
+            <w:proofErr w:type="spellStart"/>
+            <w:r>
+              <w:t>BatchMode</w:t>
+            </w:r>
+            <w:proofErr w:type="spellEnd"/>
+            <w:r>
+              <w:t xml:space="preserve">=yes -o </w:t>
+            </w:r>
+            <w:proofErr w:type="spellStart"/>
+            <w:r>
+              <w:t>ConnectTimeout</w:t>
+            </w:r>
+            <w:proofErr w:type="spellEnd"/>
+            <w:r>
+              <w:t>=1 -b 10.0.10.1 localadmin@10.0.10.2 exit &amp;</w:t>
+            </w:r>
+          </w:p>
+          <w:p>
+            <w:r>
+              <w:t xml:space="preserve">  ssh -o </w:t>
+            </w:r>
+            <w:proofErr w:type="spellStart"/>
+            <w:r>
+              <w:t>BatchMode</w:t>
+            </w:r>
+            <w:proofErr w:type="spellEnd"/>
+            <w:r>
+              <w:t xml:space="preserve">=yes -o </w:t>
+            </w:r>
+            <w:proofErr w:type="spellStart"/>
+            <w:r>
+              <w:t>ConnectTimeout</w:t>
+            </w:r>
+            <w:proofErr w:type="spellEnd"/>
+            <w:r>
+              <w:t>=1 -b 10.0.20.1 localadmin@10.0.20.2 exit &amp;</w:t>
+            </w:r>
+          </w:p>
+          <w:p>
+            <w:r>
+              <w:t xml:space="preserve">  ssh -o </w:t>
+            </w:r>
+            <w:proofErr w:type="spellStart"/>
+            <w:r>
+              <w:t>BatchMode</w:t>
+            </w:r>
+            <w:proofErr w:type="spellEnd"/>
+            <w:r>
+              <w:t xml:space="preserve">=yes -o </w:t>
+            </w:r>
+            <w:proofErr w:type="spellStart"/>
+            <w:r>
+              <w:t>ConnectTimeout</w:t>
+            </w:r>
+            <w:proofErr w:type="spellEnd"/>
+            <w:r>
+              <w:t>=1 -b 10.0.30.1 localadmin@10.0.30.2 exit &amp;</w:t>
+            </w:r>
+          </w:p>
+          <w:p>
+            <w:r>
+              <w:t xml:space="preserve">  ssh -o </w:t>
+            </w:r>
+            <w:proofErr w:type="spellStart"/>
+            <w:r>
+              <w:t>BatchMode</w:t>
+            </w:r>
+            <w:proofErr w:type="spellEnd"/>
+            <w:r>
+              <w:t xml:space="preserve">=yes -o </w:t>
+            </w:r>
+            <w:proofErr w:type="spellStart"/>
+            <w:r>
+              <w:t>ConnectTimeout</w:t>
+            </w:r>
+            <w:proofErr w:type="spellEnd"/>
+            <w:r>
+              <w:t>=1 -b 10.0.40.1 localadmin@10.0.40.2 exit &amp;</w:t>
             </w:r>
           </w:p>
           <w:p/>
@@ -291,15 +409,18 @@
               <w:t xml:space="preserve">  # HTTP (80)</w:t>
             </w:r>
             <w:r>
-              <w:t xml:space="preserve"> : 8080</w:t>
-            </w:r>
-          </w:p>
-          <w:p>
-            <w:r>
-              <w:t xml:space="preserve">  curl -s --connect-timeout 1 http://10.0.10.2</w:t>
-            </w:r>
-            <w:r>
-              <w:t>:8080</w:t>
+              <w:t xml:space="preserve"> : </w:t>
+            </w:r>
+          </w:p>
+          <w:p>
+            <w:r>
+              <w:t xml:space="preserve">  curl -s --connect-timeout 1 http://10.0.10.</w:t>
+            </w:r>
+            <w:r>
+              <w:t>2</w:t>
+            </w:r>
+            <w:r>
+              <w:t>/Desktop/</w:t>
             </w:r>
             <w:r>
               <w:t xml:space="preserve"> &gt;/dev/null &amp;</w:t>
@@ -307,10 +428,13 @@
           </w:p>
           <w:p>
             <w:r>
-              <w:t xml:space="preserve">  curl -s --connect-timeout 1 http://10.0.20.2</w:t>
-            </w:r>
-            <w:r>
-              <w:t>:8080</w:t>
+              <w:t xml:space="preserve">  curl -s --connect-timeout 1 http://10.0.20.</w:t>
+            </w:r>
+            <w:r>
+              <w:t>2</w:t>
+            </w:r>
+            <w:r>
+              <w:t>/Documents/</w:t>
             </w:r>
             <w:r>
               <w:t xml:space="preserve"> &gt;/dev/null &amp;</w:t>
@@ -318,10 +442,13 @@
           </w:p>
           <w:p>
             <w:r>
-              <w:t xml:space="preserve">  curl -s --connect-timeout 1 http://10.0.30.2</w:t>
-            </w:r>
-            <w:r>
-              <w:t>:8080</w:t>
+              <w:t xml:space="preserve">  curl -s --connect-timeout 1 http://10.0.30.</w:t>
+            </w:r>
+            <w:r>
+              <w:t>2</w:t>
+            </w:r>
+            <w:r>
+              <w:t>/Downloads/</w:t>
             </w:r>
             <w:r>
               <w:t xml:space="preserve"> &gt;/dev/null &amp;</w:t>
@@ -329,10 +456,13 @@
           </w:p>
           <w:p>
             <w:r>
-              <w:t xml:space="preserve">  curl -s --connect-timeout 1 http://10.0.40.2</w:t>
-            </w:r>
-            <w:r>
-              <w:t>:8080</w:t>
+              <w:t xml:space="preserve">  curl -s --connect-timeout 1 http://10.0.40.</w:t>
+            </w:r>
+            <w:r>
+              <w:t>2</w:t>
+            </w:r>
+            <w:r>
+              <w:t>/Music/</w:t>
             </w:r>
             <w:r>
               <w:t xml:space="preserve"> &gt;/dev/null &amp;</w:t>
@@ -346,29 +476,88 @@
           </w:p>
           <w:p>
             <w:r>
-              <w:t xml:space="preserve">  curl -sk --connect-timeout 1 https://10.0.10.2 &gt;/dev/null &amp;</w:t>
-            </w:r>
-          </w:p>
-          <w:p>
-            <w:r>
-              <w:t xml:space="preserve">  curl -sk --connect-timeout 1 https://10.0.20.2 &gt;/dev/null &amp;</w:t>
-            </w:r>
-          </w:p>
-          <w:p>
-            <w:r>
-              <w:t xml:space="preserve">  curl -sk --connect-timeout 1 https://10.0.30.2 &gt;/dev/null &amp;</w:t>
-            </w:r>
-          </w:p>
-          <w:p>
-            <w:r>
-              <w:t xml:space="preserve">  curl -sk --connect-timeout 1 https://10.0.40.2 &gt;/dev/null &amp;</w:t>
-            </w:r>
-          </w:p>
-          <w:p>
-            <w:r>
               <w:t xml:space="preserve">  </w:t>
             </w:r>
             <w:r>
+              <w:t>curl -</w:t>
+            </w:r>
+            <w:proofErr w:type="spellStart"/>
+            <w:r>
+              <w:t>sk</w:t>
+            </w:r>
+            <w:proofErr w:type="spellEnd"/>
+            <w:r>
+              <w:t xml:space="preserve"> --connect-timeout 1 </w:t>
+            </w:r>
+            <w:r>
+              <w:t>https://www.mmu.edu.my</w:t>
+            </w:r>
+            <w:r>
+              <w:t xml:space="preserve"> &gt;/dev/null &amp;</w:t>
+            </w:r>
+          </w:p>
+          <w:p>
+            <w:r>
+              <w:t xml:space="preserve">  curl -</w:t>
+            </w:r>
+            <w:proofErr w:type="spellStart"/>
+            <w:r>
+              <w:t>sk</w:t>
+            </w:r>
+            <w:proofErr w:type="spellEnd"/>
+            <w:r>
+              <w:t xml:space="preserve"> --connect-timeout 1 </w:t>
+            </w:r>
+            <w:r>
+              <w:t>https://online.mmu.edu.my</w:t>
+            </w:r>
+            <w:r>
+              <w:t xml:space="preserve"> &gt;/dev/null &amp;</w:t>
+            </w:r>
+          </w:p>
+          <w:p>
+            <w:r>
+              <w:t xml:space="preserve">  curl -</w:t>
+            </w:r>
+            <w:proofErr w:type="spellStart"/>
+            <w:r>
+              <w:t>sk</w:t>
+            </w:r>
+            <w:proofErr w:type="spellEnd"/>
+            <w:r>
+              <w:t xml:space="preserve"> --connect-timeout 1 </w:t>
+            </w:r>
+            <w:r>
+              <w:t>https://clic.mmu.edu.m</w:t>
+            </w:r>
+            <w:r>
+              <w:t>y &gt;/dev/null &amp;</w:t>
+            </w:r>
+          </w:p>
+          <w:p>
+            <w:r>
+              <w:t xml:space="preserve">  curl -</w:t>
+            </w:r>
+            <w:proofErr w:type="spellStart"/>
+            <w:r>
+              <w:t>sk</w:t>
+            </w:r>
+            <w:proofErr w:type="spellEnd"/>
+            <w:r>
+              <w:t xml:space="preserve"> --connect-timeout 1 </w:t>
+            </w:r>
+            <w:r>
+              <w:t>https://www.mmu.edu.my/pogrammes-all</w:t>
+            </w:r>
+            <w:r>
+              <w:t xml:space="preserve"> &gt;/dev/null &amp;</w:t>
+            </w:r>
+          </w:p>
+          <w:p>
+            <w:r>
+              <w:t xml:space="preserve">  </w:t>
+            </w:r>
+            <w:r>
               <w:t>curl -s -A "Mozilla/5.0 (Windows NT 10.0; Win64; x64)"</w:t>
             </w:r>
             <w:r>
@@ -385,12 +574,28 @@
           </w:p>
           <w:p>
             <w:r>
-              <w:t xml:space="preserve">     -H "Content-Type: application/json" \</w:t>
-            </w:r>
-          </w:p>
-          <w:p>
-            <w:r>
-              <w:t xml:space="preserve">     -d '{"event":"test"}' &gt;/dev/null &amp;</w:t>
+              <w:t xml:space="preserve">     -H "Content-Type: application/</w:t>
+            </w:r>
+            <w:proofErr w:type="spellStart"/>
+            <w:r>
+              <w:t>json</w:t>
+            </w:r>
+            <w:proofErr w:type="spellEnd"/>
+            <w:r>
+              <w:t>" \</w:t>
+            </w:r>
+          </w:p>
+          <w:p>
+            <w:r>
+              <w:t xml:space="preserve">     -d '{"</w:t>
+            </w:r>
+            <w:proofErr w:type="spellStart"/>
+            <w:r>
+              <w:t>event":"test</w:t>
+            </w:r>
+            <w:proofErr w:type="spellEnd"/>
+            <w:r>
+              <w:t>"}' &gt;/dev/null &amp;</w:t>
             </w:r>
           </w:p>
           <w:p>
@@ -432,22 +637,54 @@
           </w:p>
           <w:p>
             <w:r>
-              <w:t xml:space="preserve">  echo test | nc -w1 10.0.10.2 445 &amp;</w:t>
-            </w:r>
-          </w:p>
-          <w:p>
-            <w:r>
-              <w:t xml:space="preserve">  echo test | nc -w1 10.0.20.2 445 &amp;</w:t>
-            </w:r>
-          </w:p>
-          <w:p>
-            <w:r>
-              <w:t xml:space="preserve">  echo test | nc -w1 10.0.30.2 445 &amp;</w:t>
-            </w:r>
-          </w:p>
-          <w:p>
-            <w:r>
-              <w:t xml:space="preserve">  echo test | nc -w1 10.0.40.2 445 &amp;</w:t>
+              <w:t xml:space="preserve">  echo test | </w:t>
+            </w:r>
+            <w:proofErr w:type="spellStart"/>
+            <w:r>
+              <w:t>nc</w:t>
+            </w:r>
+            <w:proofErr w:type="spellEnd"/>
+            <w:r>
+              <w:t xml:space="preserve"> -w1 10.0.10.2 445 &amp;</w:t>
+            </w:r>
+          </w:p>
+          <w:p>
+            <w:r>
+              <w:t xml:space="preserve">  echo test | </w:t>
+            </w:r>
+            <w:proofErr w:type="spellStart"/>
+            <w:r>
+              <w:t>nc</w:t>
+            </w:r>
+            <w:proofErr w:type="spellEnd"/>
+            <w:r>
+              <w:t xml:space="preserve"> -w1 10.0.20.2 445 &amp;</w:t>
+            </w:r>
+          </w:p>
+          <w:p>
+            <w:r>
+              <w:t xml:space="preserve">  echo test | </w:t>
+            </w:r>
+            <w:proofErr w:type="spellStart"/>
+            <w:r>
+              <w:t>nc</w:t>
+            </w:r>
+            <w:proofErr w:type="spellEnd"/>
+            <w:r>
+              <w:t xml:space="preserve"> -w1 10.0.30.2 445 &amp;</w:t>
+            </w:r>
+          </w:p>
+          <w:p>
+            <w:r>
+              <w:t xml:space="preserve">  echo test | </w:t>
+            </w:r>
+            <w:proofErr w:type="spellStart"/>
+            <w:r>
+              <w:t>nc</w:t>
+            </w:r>
+            <w:proofErr w:type="spellEnd"/>
+            <w:r>
+              <w:t xml:space="preserve"> -w1 10.0.40.2 445 &amp;</w:t>
             </w:r>
           </w:p>
           <w:p/>
@@ -491,31 +728,141 @@
     <w:p/>
     <w:p>
       <w:r>
-        <w:t>cd /home/localadmin/</w:t>
-      </w:r>
-      <w:r>
-        <w:t>packet-header_n_frame-analysis</w:t>
-      </w:r>
-    </w:p>
-    <w:p>
-      <w:r>
-        <w:t>sudo -E ~/vlanlab/bin/python fyp1.py</w:t>
+        <w:t>cd /home/</w:t>
+      </w:r>
+      <w:proofErr w:type="spellStart"/>
+      <w:r>
+        <w:t>localadmin</w:t>
+      </w:r>
+      <w:proofErr w:type="spellEnd"/>
+      <w:r>
+        <w:t>/</w:t>
+      </w:r>
+      <w:r>
+        <w:t>packet-</w:t>
+      </w:r>
+      <w:proofErr w:type="spellStart"/>
+      <w:r>
+        <w:t>header_n_frame</w:t>
+      </w:r>
+      <w:proofErr w:type="spellEnd"/>
+      <w:r>
+        <w:t>-analysis</w:t>
+      </w:r>
+    </w:p>
+    <w:p>
+      <w:proofErr w:type="spellStart"/>
+      <w:r>
+        <w:t>sudo</w:t>
+      </w:r>
+      <w:proofErr w:type="spellEnd"/>
+      <w:r>
+        <w:t xml:space="preserve"> -E ~/</w:t>
+      </w:r>
+      <w:proofErr w:type="spellStart"/>
+      <w:r>
+        <w:t>vlanlab</w:t>
+      </w:r>
+      <w:proofErr w:type="spellEnd"/>
+      <w:r>
+        <w:t>/bin/python fyp1.py</w:t>
+      </w:r>
+    </w:p>
+    <w:p>
+      <w:proofErr w:type="spellStart"/>
+      <w:r>
+        <w:t>sudo</w:t>
+      </w:r>
+      <w:proofErr w:type="spellEnd"/>
+      <w:r>
+        <w:t xml:space="preserve"> -E ~/</w:t>
+      </w:r>
+      <w:proofErr w:type="spellStart"/>
+      <w:r>
+        <w:t>vlanlab</w:t>
+      </w:r>
+      <w:proofErr w:type="spellEnd"/>
+      <w:r>
+        <w:t>/bin/python app.py</w:t>
       </w:r>
     </w:p>
     <w:p/>
     <w:p>
-      <w:r>
-        <w:t>python3 -m http.server 8080 &amp;</w:t>
-      </w:r>
-    </w:p>
-    <w:p>
-      <w:r>
-        <w:t>openssl s_server -accept 443 -cert cert.pem -key key.pem -www &amp;</w:t>
-      </w:r>
-    </w:p>
-    <w:p>
-      <w:r>
-        <w:t>sudo nc -lkp 445</w:t>
+      <w:proofErr w:type="spellStart"/>
+      <w:r>
+        <w:t>sudo</w:t>
+      </w:r>
+      <w:proofErr w:type="spellEnd"/>
+      <w:r>
+        <w:t xml:space="preserve"> python3 -m </w:t>
+      </w:r>
+      <w:proofErr w:type="spellStart"/>
+      <w:r>
+        <w:t>http.server</w:t>
+      </w:r>
+      <w:proofErr w:type="spellEnd"/>
+      <w:r>
+        <w:t xml:space="preserve"> 80</w:t>
+      </w:r>
+    </w:p>
+    <w:p>
+      <w:proofErr w:type="spellStart"/>
+      <w:r>
+        <w:t>openssl</w:t>
+      </w:r>
+      <w:proofErr w:type="spellEnd"/>
+      <w:r>
+        <w:t xml:space="preserve"> </w:t>
+      </w:r>
+      <w:proofErr w:type="spellStart"/>
+      <w:r>
+        <w:t>s_server</w:t>
+      </w:r>
+      <w:proofErr w:type="spellEnd"/>
+      <w:r>
+        <w:t xml:space="preserve"> -accept 443 -cert </w:t>
+      </w:r>
+      <w:proofErr w:type="spellStart"/>
+      <w:r>
+        <w:t>cert.pem</w:t>
+      </w:r>
+      <w:proofErr w:type="spellEnd"/>
+      <w:r>
+        <w:t xml:space="preserve"> -key </w:t>
+      </w:r>
+      <w:proofErr w:type="spellStart"/>
+      <w:r>
+        <w:t>key.pem</w:t>
+      </w:r>
+      <w:proofErr w:type="spellEnd"/>
+      <w:r>
+        <w:t xml:space="preserve"> -www &amp;</w:t>
+      </w:r>
+    </w:p>
+    <w:p>
+      <w:proofErr w:type="spellStart"/>
+      <w:r>
+        <w:t>sudo</w:t>
+      </w:r>
+      <w:proofErr w:type="spellEnd"/>
+      <w:r>
+        <w:t xml:space="preserve"> </w:t>
+      </w:r>
+      <w:proofErr w:type="spellStart"/>
+      <w:r>
+        <w:t>nc</w:t>
+      </w:r>
+      <w:proofErr w:type="spellEnd"/>
+      <w:r>
+        <w:t xml:space="preserve"> -</w:t>
+      </w:r>
+      <w:proofErr w:type="spellStart"/>
+      <w:r>
+        <w:t>lkp</w:t>
+      </w:r>
+      <w:proofErr w:type="spellEnd"/>
+      <w:r>
+        <w:t xml:space="preserve"> 445</w:t>
       </w:r>
     </w:p>
     <w:tbl>
@@ -547,22 +894,86 @@
           </w:p>
           <w:p>
             <w:r>
-              <w:t xml:space="preserve">  ssh -o BatchMode=yes -o ConnectTimeout=1 -b 10.0.10.2 localadmin@10.0.10.1 exit &amp;</w:t>
-            </w:r>
-          </w:p>
-          <w:p>
-            <w:r>
-              <w:t xml:space="preserve">  ssh -o BatchMode=yes -o ConnectTimeout=1 -b 10.0.20.2 localadmin@10.0.20.1 exit &amp;</w:t>
-            </w:r>
-          </w:p>
-          <w:p>
-            <w:r>
-              <w:t xml:space="preserve">  ssh -o BatchMode=yes -o ConnectTimeout=1 -b 10.0.30.2 localadmin@10.0.30.1 exit &amp;</w:t>
-            </w:r>
-          </w:p>
-          <w:p>
-            <w:r>
-              <w:t xml:space="preserve">  ssh -o BatchMode=yes -o ConnectTimeout=1 -b 10.0.40.2 localadmin@10.0.40.1 exit &amp;</w:t>
+              <w:t xml:space="preserve">  ssh -o </w:t>
+            </w:r>
+            <w:proofErr w:type="spellStart"/>
+            <w:r>
+              <w:t>BatchMode</w:t>
+            </w:r>
+            <w:proofErr w:type="spellEnd"/>
+            <w:r>
+              <w:t xml:space="preserve">=yes -o </w:t>
+            </w:r>
+            <w:proofErr w:type="spellStart"/>
+            <w:r>
+              <w:t>ConnectTimeout</w:t>
+            </w:r>
+            <w:proofErr w:type="spellEnd"/>
+            <w:r>
+              <w:t>=1 -b 10.0.10.2 localadmin@10.0.10.1 exit &amp;</w:t>
+            </w:r>
+          </w:p>
+          <w:p>
+            <w:r>
+              <w:t xml:space="preserve">  ssh -o </w:t>
+            </w:r>
+            <w:proofErr w:type="spellStart"/>
+            <w:r>
+              <w:t>BatchMode</w:t>
+            </w:r>
+            <w:proofErr w:type="spellEnd"/>
+            <w:r>
+              <w:t xml:space="preserve">=yes -o </w:t>
+            </w:r>
+            <w:proofErr w:type="spellStart"/>
+            <w:r>
+              <w:t>ConnectTimeout</w:t>
+            </w:r>
+            <w:proofErr w:type="spellEnd"/>
+            <w:r>
+              <w:t>=1 -b 10.0.20.2 localadmin@10.0.20.1 exit &amp;</w:t>
+            </w:r>
+          </w:p>
+          <w:p>
+            <w:r>
+              <w:t xml:space="preserve">  ssh -o </w:t>
+            </w:r>
+            <w:proofErr w:type="spellStart"/>
+            <w:r>
+              <w:t>BatchMode</w:t>
+            </w:r>
+            <w:proofErr w:type="spellEnd"/>
+            <w:r>
+              <w:t xml:space="preserve">=yes -o </w:t>
+            </w:r>
+            <w:proofErr w:type="spellStart"/>
+            <w:r>
+              <w:t>ConnectTimeout</w:t>
+            </w:r>
+            <w:proofErr w:type="spellEnd"/>
+            <w:r>
+              <w:t>=1 -b 10.0.30.2 localadmin@10.0.30.1 exit &amp;</w:t>
+            </w:r>
+          </w:p>
+          <w:p>
+            <w:r>
+              <w:t xml:space="preserve">  ssh -o </w:t>
+            </w:r>
+            <w:proofErr w:type="spellStart"/>
+            <w:r>
+              <w:t>BatchMode</w:t>
+            </w:r>
+            <w:proofErr w:type="spellEnd"/>
+            <w:r>
+              <w:t xml:space="preserve">=yes -o </w:t>
+            </w:r>
+            <w:proofErr w:type="spellStart"/>
+            <w:r>
+              <w:t>ConnectTimeout</w:t>
+            </w:r>
+            <w:proofErr w:type="spellEnd"/>
+            <w:r>
+              <w:t>=1 -b 10.0.40.2 localadmin@10.0.40.1 exit &amp;</w:t>
             </w:r>
           </w:p>
           <w:p/>
@@ -579,22 +990,46 @@
           </w:p>
           <w:p>
             <w:r>
-              <w:t xml:space="preserve">  curl -s --connect-timeout 1 http://10.0.10.1 &gt;/dev/null &amp;</w:t>
-            </w:r>
-          </w:p>
-          <w:p>
-            <w:r>
-              <w:t xml:space="preserve">  curl -s --connect-timeout 1 http://10.0.20.1 &gt;/dev/null &amp;</w:t>
-            </w:r>
-          </w:p>
-          <w:p>
-            <w:r>
-              <w:t xml:space="preserve">  curl -s --connect-timeout 1 http://10.0.30.1 &gt;/dev/null &amp;</w:t>
-            </w:r>
-          </w:p>
-          <w:p>
-            <w:r>
-              <w:t xml:space="preserve">  curl -s --connect-timeout 1 http://10.0.40.1 &gt;/dev/null &amp;</w:t>
+              <w:t xml:space="preserve">  curl -s --connect-timeout 1 http://10.0.10.1</w:t>
+            </w:r>
+            <w:r>
+              <w:t>/Desktop/</w:t>
+            </w:r>
+            <w:r>
+              <w:t xml:space="preserve"> &gt;/dev/null &amp;</w:t>
+            </w:r>
+          </w:p>
+          <w:p>
+            <w:r>
+              <w:t xml:space="preserve">  curl -s --connect-timeout 1 http://10.0.20.1</w:t>
+            </w:r>
+            <w:r>
+              <w:t>/Documents/</w:t>
+            </w:r>
+            <w:r>
+              <w:t xml:space="preserve"> &gt;/dev/null &amp;</w:t>
+            </w:r>
+          </w:p>
+          <w:p>
+            <w:r>
+              <w:t xml:space="preserve">  curl -s --connect-timeout 1 http://10.0.30.1</w:t>
+            </w:r>
+            <w:r>
+              <w:t>/Downloads/</w:t>
+            </w:r>
+            <w:r>
+              <w:t xml:space="preserve"> &gt;/dev/null &amp;</w:t>
+            </w:r>
+          </w:p>
+          <w:p>
+            <w:r>
+              <w:t xml:space="preserve">  curl -s --connect-timeout 1 http://10.0.40.1</w:t>
+            </w:r>
+            <w:r>
+              <w:t>/Music/</w:t>
+            </w:r>
+            <w:r>
+              <w:t xml:space="preserve"> &gt;/dev/null &amp;</w:t>
             </w:r>
           </w:p>
           <w:p/>
@@ -605,22 +1040,81 @@
           </w:p>
           <w:p>
             <w:r>
-              <w:t xml:space="preserve">  curl -sk --connect-timeout 1 https://10.0.10.1 &gt;/dev/null &amp;</w:t>
-            </w:r>
-          </w:p>
-          <w:p>
-            <w:r>
-              <w:t xml:space="preserve">  curl -sk --connect-timeout 1 https://10.0.20.1 &gt;/dev/null &amp;</w:t>
-            </w:r>
-          </w:p>
-          <w:p>
-            <w:r>
-              <w:t xml:space="preserve">  curl -sk --connect-timeout 1 https://10.0.30.1 &gt;/dev/null &amp;</w:t>
-            </w:r>
-          </w:p>
-          <w:p>
-            <w:r>
-              <w:t xml:space="preserve">  curl -sk --connect-timeout 1 https://10.0.40.1 &gt;/dev/null &amp;</w:t>
+              <w:t xml:space="preserve">  curl -</w:t>
+            </w:r>
+            <w:proofErr w:type="spellStart"/>
+            <w:r>
+              <w:t>sk</w:t>
+            </w:r>
+            <w:proofErr w:type="spellEnd"/>
+            <w:r>
+              <w:t xml:space="preserve"> --connect-timeout 1 </w:t>
+            </w:r>
+            <w:r>
+              <w:t>https://www.mmu.edu.my</w:t>
+            </w:r>
+            <w:r>
+              <w:t xml:space="preserve"> &gt;/dev/null &amp;</w:t>
+            </w:r>
+          </w:p>
+          <w:p>
+            <w:r>
+              <w:t xml:space="preserve">  curl -</w:t>
+            </w:r>
+            <w:proofErr w:type="spellStart"/>
+            <w:r>
+              <w:t>sk</w:t>
+            </w:r>
+            <w:proofErr w:type="spellEnd"/>
+            <w:r>
+              <w:t xml:space="preserve"> --connect-timeout 1 </w:t>
+            </w:r>
+            <w:r>
+              <w:t>https://online.mmu.edu.my</w:t>
+            </w:r>
+            <w:r>
+              <w:t xml:space="preserve"> &gt;/dev/null &amp;</w:t>
+            </w:r>
+          </w:p>
+          <w:p>
+            <w:r>
+              <w:t xml:space="preserve">  curl -</w:t>
+            </w:r>
+            <w:proofErr w:type="spellStart"/>
+            <w:r>
+              <w:t>sk</w:t>
+            </w:r>
+            <w:proofErr w:type="spellEnd"/>
+            <w:r>
+              <w:t xml:space="preserve"> --connect-timeout 1 </w:t>
+            </w:r>
+            <w:r>
+              <w:t>https://clic.mmu.edu.m</w:t>
+            </w:r>
+            <w:r>
+              <w:t>y</w:t>
+            </w:r>
+            <w:r>
+              <w:t xml:space="preserve"> &gt;/dev/null &amp;</w:t>
+            </w:r>
+          </w:p>
+          <w:p>
+            <w:r>
+              <w:t xml:space="preserve">  curl -</w:t>
+            </w:r>
+            <w:proofErr w:type="spellStart"/>
+            <w:r>
+              <w:t>sk</w:t>
+            </w:r>
+            <w:proofErr w:type="spellEnd"/>
+            <w:r>
+              <w:t xml:space="preserve"> --connect-timeout 1 </w:t>
+            </w:r>
+            <w:r>
+              <w:t>https://www.mmu.edu.my/pogrammes-all</w:t>
+            </w:r>
+            <w:r>
+              <w:t xml:space="preserve"> &gt;/dev/null &amp;</w:t>
             </w:r>
           </w:p>
           <w:p>
@@ -644,12 +1138,28 @@
           </w:p>
           <w:p>
             <w:r>
-              <w:t xml:space="preserve">     -H "Content-Type: application/json" \</w:t>
-            </w:r>
-          </w:p>
-          <w:p>
-            <w:r>
-              <w:t xml:space="preserve">     -d '{"event":"test"}' &gt;/dev/null &amp;</w:t>
+              <w:t xml:space="preserve">     -H "Content-Type: application/</w:t>
+            </w:r>
+            <w:proofErr w:type="spellStart"/>
+            <w:r>
+              <w:t>json</w:t>
+            </w:r>
+            <w:proofErr w:type="spellEnd"/>
+            <w:r>
+              <w:t>" \</w:t>
+            </w:r>
+          </w:p>
+          <w:p>
+            <w:r>
+              <w:t xml:space="preserve">     -d '{"</w:t>
+            </w:r>
+            <w:proofErr w:type="spellStart"/>
+            <w:r>
+              <w:t>event":"test</w:t>
+            </w:r>
+            <w:proofErr w:type="spellEnd"/>
+            <w:r>
+              <w:t>"}' &gt;/dev/null &amp;</w:t>
             </w:r>
           </w:p>
           <w:p>
@@ -694,23 +1204,55 @@
           </w:p>
           <w:p>
             <w:r>
-              <w:t xml:space="preserve">  echo test | nc -w1 10.0.10.1 445 &amp;</w:t>
-            </w:r>
-          </w:p>
-          <w:p>
-            <w:r>
-              <w:t xml:space="preserve">  echo test | nc -w1 10.0.20.1 445 &amp;</w:t>
-            </w:r>
-          </w:p>
-          <w:p>
-            <w:r>
-              <w:t xml:space="preserve">  echo test | nc -w1 10.0.30.1 445 &amp;</w:t>
+              <w:t xml:space="preserve">  echo test | </w:t>
+            </w:r>
+            <w:proofErr w:type="spellStart"/>
+            <w:r>
+              <w:t>nc</w:t>
+            </w:r>
+            <w:proofErr w:type="spellEnd"/>
+            <w:r>
+              <w:t xml:space="preserve"> -w1 10.0.10.1 445 &amp;</w:t>
             </w:r>
           </w:p>
           <w:p>
             <w:r>
               <w:lastRenderedPageBreak/>
-              <w:t xml:space="preserve">  echo test | nc -w1 10.0.40.1 445 &amp;</w:t>
+              <w:t xml:space="preserve">  echo test | </w:t>
+            </w:r>
+            <w:proofErr w:type="spellStart"/>
+            <w:r>
+              <w:t>nc</w:t>
+            </w:r>
+            <w:proofErr w:type="spellEnd"/>
+            <w:r>
+              <w:t xml:space="preserve"> -w1 10.0.20.1 445 &amp;</w:t>
+            </w:r>
+          </w:p>
+          <w:p>
+            <w:r>
+              <w:t xml:space="preserve">  echo test | </w:t>
+            </w:r>
+            <w:proofErr w:type="spellStart"/>
+            <w:r>
+              <w:t>nc</w:t>
+            </w:r>
+            <w:proofErr w:type="spellEnd"/>
+            <w:r>
+              <w:t xml:space="preserve"> -w1 10.0.30.1 445 &amp;</w:t>
+            </w:r>
+          </w:p>
+          <w:p>
+            <w:r>
+              <w:t xml:space="preserve">  echo test | </w:t>
+            </w:r>
+            <w:proofErr w:type="spellStart"/>
+            <w:r>
+              <w:t>nc</w:t>
+            </w:r>
+            <w:proofErr w:type="spellEnd"/>
+            <w:r>
+              <w:t xml:space="preserve"> -w1 10.0.40.1 445 &amp;</w:t>
             </w:r>
           </w:p>
           <w:p/>
@@ -733,26 +1275,6 @@
         </w:tc>
       </w:tr>
     </w:tbl>
-    <w:p>
-      <w:pPr>
-        <w:pBdr>
-          <w:bottom w:val="double" w:sz="6" w:space="1" w:color="auto"/>
-        </w:pBdr>
-      </w:pPr>
-    </w:p>
-    <w:p>
-      <w:r>
-        <w:t>cd /home/localadmin/</w:t>
-      </w:r>
-      <w:r>
-        <w:t>packet-header_n_frame-analysis</w:t>
-      </w:r>
-    </w:p>
-    <w:p>
-      <w:r>
-        <w:t>sudo -E ~/vlanlab/bin/python app.py</w:t>
-      </w:r>
-    </w:p>
     <w:p/>
     <w:p/>
     <w:p>
@@ -814,91 +1336,118 @@
           <w:szCs w:val="22"/>
         </w:rPr>
       </w:pPr>
+      <w:proofErr w:type="spellStart"/>
       <w:r>
         <w:rPr>
           <w:sz w:val="22"/>
           <w:szCs w:val="22"/>
         </w:rPr>
-        <w:t>scp localadmin@192.168.85.130:/home/localadmin/</w:t>
-      </w:r>
+        <w:t>scp</w:t>
+      </w:r>
+      <w:proofErr w:type="spellEnd"/>
       <w:r>
         <w:rPr>
           <w:sz w:val="22"/>
           <w:szCs w:val="22"/>
         </w:rPr>
-        <w:t>packet-header_n_frame-analysis</w:t>
+        <w:t xml:space="preserve"> localadmin@192.168.85.130:/home/localadmin/</w:t>
       </w:r>
       <w:r>
         <w:rPr>
           <w:sz w:val="22"/>
           <w:szCs w:val="22"/>
         </w:rPr>
-        <w:t xml:space="preserve">/*.csv </w:t>
+        <w:t>packet-header_n_frame-analysis</w:t>
       </w:r>
       <w:r>
         <w:rPr>
           <w:sz w:val="22"/>
           <w:szCs w:val="22"/>
         </w:rPr>
-        <w:t>"D:/"</w:t>
-      </w:r>
-    </w:p>
-    <w:p>
-      <w:pPr>
+        <w:t xml:space="preserve">/*.csv </w:t>
+      </w:r>
+      <w:r>
         <w:rPr>
           <w:sz w:val="22"/>
           <w:szCs w:val="22"/>
         </w:rPr>
-      </w:pPr>
-      <w:r>
+        <w:t>"D:/"</w:t>
+      </w:r>
+    </w:p>
+    <w:p>
+      <w:pPr>
         <w:rPr>
           <w:sz w:val="22"/>
           <w:szCs w:val="22"/>
         </w:rPr>
-        <w:t xml:space="preserve">scp </w:t>
-      </w:r>
+      </w:pPr>
+      <w:proofErr w:type="spellStart"/>
       <w:r>
         <w:rPr>
           <w:sz w:val="22"/>
           <w:szCs w:val="22"/>
         </w:rPr>
-        <w:t>localadmin@192.168.85.130:/home/localadmin/</w:t>
-      </w:r>
+        <w:t>scp</w:t>
+      </w:r>
+      <w:proofErr w:type="spellEnd"/>
       <w:r>
         <w:rPr>
           <w:sz w:val="22"/>
           <w:szCs w:val="22"/>
         </w:rPr>
-        <w:t>packet-header_n_frame-analysis</w:t>
+        <w:t xml:space="preserve"> </w:t>
       </w:r>
       <w:r>
         <w:rPr>
           <w:sz w:val="22"/>
           <w:szCs w:val="22"/>
         </w:rPr>
-        <w:t xml:space="preserve">/*.txt </w:t>
+        <w:t>localadmin@192.168.85.130:/home/localadmin/</w:t>
       </w:r>
       <w:r>
         <w:rPr>
           <w:sz w:val="22"/>
           <w:szCs w:val="22"/>
         </w:rPr>
-        <w:t>"D:/"</w:t>
-      </w:r>
-    </w:p>
-    <w:p>
-      <w:pPr>
+        <w:t>packet-header_n_frame-analysis</w:t>
+      </w:r>
+      <w:r>
         <w:rPr>
           <w:sz w:val="22"/>
           <w:szCs w:val="22"/>
         </w:rPr>
-      </w:pPr>
+        <w:t xml:space="preserve">/*.txt </w:t>
+      </w:r>
       <w:r>
         <w:rPr>
           <w:sz w:val="22"/>
           <w:szCs w:val="22"/>
         </w:rPr>
-        <w:t xml:space="preserve">scp </w:t>
+        <w:t>"D:/"</w:t>
+      </w:r>
+    </w:p>
+    <w:p>
+      <w:pPr>
+        <w:rPr>
+          <w:sz w:val="22"/>
+          <w:szCs w:val="22"/>
+        </w:rPr>
+      </w:pPr>
+      <w:proofErr w:type="spellStart"/>
+      <w:r>
+        <w:rPr>
+          <w:sz w:val="22"/>
+          <w:szCs w:val="22"/>
+        </w:rPr>
+        <w:t>scp</w:t>
+      </w:r>
+      <w:proofErr w:type="spellEnd"/>
+      <w:r>
+        <w:rPr>
+          <w:sz w:val="22"/>
+          <w:szCs w:val="22"/>
+        </w:rPr>
+        <w:t xml:space="preserve"> </w:t>
       </w:r>
       <w:r>
         <w:rPr>
@@ -982,12 +1531,21 @@
           <w:szCs w:val="22"/>
         </w:rPr>
       </w:pPr>
+      <w:proofErr w:type="spellStart"/>
       <w:r>
         <w:rPr>
           <w:sz w:val="22"/>
           <w:szCs w:val="22"/>
         </w:rPr>
-        <w:t>scp .\.env  localadmin@192.168.85.130:/home/localadmin/</w:t>
+        <w:t>scp</w:t>
+      </w:r>
+      <w:proofErr w:type="spellEnd"/>
+      <w:r>
+        <w:rPr>
+          <w:sz w:val="22"/>
+          <w:szCs w:val="22"/>
+        </w:rPr>
+        <w:t xml:space="preserve"> .\.env  localadmin@192.168.85.130:/home/localadmin/</w:t>
       </w:r>
       <w:r>
         <w:rPr>
@@ -1414,7 +1972,7 @@
   <w:style w:type="paragraph" w:default="1" w:styleId="Normal">
     <w:name w:val="Normal"/>
     <w:qFormat/>
-    <w:rsid w:val="004B3CFC"/>
+    <w:rsid w:val="00111909"/>
   </w:style>
   <w:style w:type="paragraph" w:styleId="Heading1">
     <w:name w:val="heading 1"/>
@@ -1618,7 +2176,6 @@
   <w:style w:type="character" w:default="1" w:styleId="DefaultParagraphFont">
     <w:name w:val="Default Paragraph Font"/>
     <w:uiPriority w:val="1"/>
-    <w:semiHidden/>
     <w:unhideWhenUsed/>
   </w:style>
   <w:style w:type="table" w:default="1" w:styleId="TableNormal">

</xml_diff>